<commit_message>
docs: ใส่ header/footer ของ template YSC ทางการ (แบนเนอร์+โลโก้+footer version) ลง proposal_ysc.docx
</commit_message>
<xml_diff>
--- a/docs/proposal_ysc.docx
+++ b/docs/proposal_ysc.docx
@@ -7155,6 +7155,7 @@
     </w:p>
     <w:sectPr>
       <w:footerReference w:type="default" r:id="rId9"/>
+      <w:headerReference w:type="default" r:id="rId10"/>
       <w:pgSz w:w="11906" w:h="16838"/>
       <w:pgMar w:top="1440" w:right="1440" w:bottom="1440" w:left="1440" w:header="720" w:footer="720" w:gutter="0"/>
       <w:cols w:space="720"/>
@@ -7170,27 +7171,368 @@
     <w:pPr>
       <w:pStyle w:val="Footer"/>
       <w:jc w:val="center"/>
+      <w:rPr>
+        <w:rFonts w:ascii="TH Sarabun New" w:hAnsi="TH Sarabun New" w:cs="TH Sarabun New"/>
+      </w:rPr>
     </w:pPr>
-    <w:r>
-      <w:rPr>
-        <w:rFonts w:ascii="TH SarabunPSK" w:hAnsi="TH SarabunPSK" w:eastAsia="TH SarabunPSK" w:cs="TH SarabunPSK"/>
-        <w:b w:val="0"/>
-        <w:i w:val="0"/>
-        <w:sz w:val="28"/>
-      </w:rPr>
-      <w:t xml:space="preserve">หน้า </w:t>
-    </w:r>
-    <w:fldSimple w:instr="PAGE"/>
-    <w:r>
-      <w:rPr>
-        <w:rFonts w:ascii="TH SarabunPSK" w:hAnsi="TH SarabunPSK" w:eastAsia="TH SarabunPSK" w:cs="TH SarabunPSK"/>
-        <w:b w:val="0"/>
-        <w:i w:val="0"/>
-        <w:sz w:val="28"/>
-      </w:rPr>
-    </w:r>
+  </w:p>
+  <w:tbl>
+    <w:tblPr>
+      <w:tblStyle w:val="TableGrid"/>
+      <w:tblW w:w="0" w:type="auto"/>
+      <w:tblBorders>
+        <w:left w:val="none" w:sz="0" w:space="0" w:color="auto"/>
+        <w:bottom w:val="none" w:sz="0" w:space="0" w:color="auto"/>
+        <w:right w:val="none" w:sz="0" w:space="0" w:color="auto"/>
+        <w:insideH w:val="none" w:sz="0" w:space="0" w:color="auto"/>
+        <w:insideV w:val="none" w:sz="0" w:space="0" w:color="auto"/>
+      </w:tblBorders>
+      <w:tblLook w:val="04A0" w:firstRow="1" w:lastRow="0" w:firstColumn="1" w:lastColumn="0" w:noHBand="0" w:noVBand="1"/>
+    </w:tblPr>
+    <w:tblGrid>
+      <w:gridCol w:w="4868"/>
+      <w:gridCol w:w="4868"/>
+    </w:tblGrid>
+    <w:tr>
+      <w:tc>
+        <w:tcPr>
+          <w:tcW w:w="4868" w:type="dxa"/>
+          <w:vAlign w:val="center"/>
+        </w:tcPr>
+        <w:p>
+          <w:pPr>
+            <w:pStyle w:val="Footer"/>
+            <w:rPr>
+              <w:rFonts w:ascii="TH Sarabun New" w:hAnsi="TH Sarabun New" w:cs="TH Sarabun New"/>
+              <w:i/>
+              <w:iCs/>
+              <w:sz w:val="28"/>
+              <w:szCs w:val="28"/>
+              <w:lang w:val="en-US"/>
+            </w:rPr>
+          </w:pPr>
+          <w:r>
+            <w:rPr>
+              <w:rFonts w:ascii="TH Sarabun New" w:hAnsi="TH Sarabun New" w:cs="TH Sarabun New" w:hint="cs"/>
+              <w:i/>
+              <w:iCs/>
+              <w:sz w:val="28"/>
+              <w:szCs w:val="28"/>
+              <w:lang w:val="en-US"/>
+            </w:rPr>
+            <w:t>Version</w:t>
+          </w:r>
+          <w:r>
+            <w:rPr>
+              <w:rFonts w:ascii="TH Sarabun New" w:hAnsi="TH Sarabun New" w:cs="TH Sarabun New" w:hint="cs"/>
+              <w:i/>
+              <w:iCs/>
+              <w:sz w:val="28"/>
+              <w:szCs w:val="28"/>
+              <w:cs/>
+            </w:rPr>
+            <w:t xml:space="preserve"> </w:t>
+          </w:r>
+          <w:r>
+            <w:rPr>
+              <w:rFonts w:ascii="TH Sarabun New" w:hAnsi="TH Sarabun New" w:cs="TH Sarabun New" w:hint="cs"/>
+              <w:i/>
+              <w:iCs/>
+              <w:sz w:val="28"/>
+              <w:szCs w:val="28"/>
+              <w:lang w:val="en-US"/>
+            </w:rPr>
+            <w:t>3</w:t>
+          </w:r>
+          <w:r>
+            <w:rPr>
+              <w:rFonts w:ascii="TH Sarabun New" w:hAnsi="TH Sarabun New" w:cs="TH Sarabun New"/>
+              <w:i/>
+              <w:iCs/>
+              <w:sz w:val="28"/>
+              <w:szCs w:val="28"/>
+              <w:lang w:val="en-US"/>
+            </w:rPr>
+            <w:t xml:space="preserve"> (</w:t>
+          </w:r>
+          <w:r>
+            <w:rPr>
+              <w:rFonts w:ascii="TH Sarabun New" w:hAnsi="TH Sarabun New" w:cs="TH Sarabun New" w:hint="cs"/>
+              <w:i/>
+              <w:iCs/>
+              <w:sz w:val="28"/>
+              <w:szCs w:val="28"/>
+              <w:cs/>
+              <w:lang w:val="en-US"/>
+            </w:rPr>
+            <w:t>วันที่มีผลบังคับใช้</w:t>
+          </w:r>
+          <w:r>
+            <w:rPr>
+              <w:rFonts w:ascii="TH Sarabun New" w:hAnsi="TH Sarabun New" w:cs="TH Sarabun New" w:hint="cs"/>
+              <w:i/>
+              <w:iCs/>
+              <w:sz w:val="28"/>
+              <w:szCs w:val="28"/>
+              <w:lang w:val="en-US"/>
+            </w:rPr>
+            <w:t xml:space="preserve">: 20 </w:t>
+          </w:r>
+          <w:r>
+            <w:rPr>
+              <w:rFonts w:ascii="TH Sarabun New" w:hAnsi="TH Sarabun New" w:cs="TH Sarabun New" w:hint="cs"/>
+              <w:i/>
+              <w:iCs/>
+              <w:sz w:val="28"/>
+              <w:szCs w:val="28"/>
+              <w:cs/>
+              <w:lang w:val="en-US"/>
+            </w:rPr>
+            <w:t xml:space="preserve">กรกฎาคม </w:t>
+          </w:r>
+          <w:r>
+            <w:rPr>
+              <w:rFonts w:ascii="TH Sarabun New" w:hAnsi="TH Sarabun New" w:cs="TH Sarabun New" w:hint="cs"/>
+              <w:i/>
+              <w:iCs/>
+              <w:sz w:val="28"/>
+              <w:szCs w:val="28"/>
+              <w:lang w:val="en-US"/>
+            </w:rPr>
+            <w:t>2569</w:t>
+          </w:r>
+          <w:r>
+            <w:rPr>
+              <w:rFonts w:ascii="TH Sarabun New" w:hAnsi="TH Sarabun New" w:cs="TH Sarabun New"/>
+              <w:i/>
+              <w:iCs/>
+              <w:sz w:val="28"/>
+              <w:szCs w:val="28"/>
+              <w:lang w:val="en-US"/>
+            </w:rPr>
+            <w:t>)</w:t>
+          </w:r>
+        </w:p>
+      </w:tc>
+      <w:tc>
+        <w:tcPr>
+          <w:tcW w:w="4868" w:type="dxa"/>
+          <w:vAlign w:val="center"/>
+        </w:tcPr>
+        <w:p>
+          <w:pPr>
+            <w:pStyle w:val="Footer"/>
+            <w:jc w:val="right"/>
+            <w:rPr>
+              <w:rFonts w:ascii="TH Sarabun New" w:hAnsi="TH Sarabun New" w:cs="TH Sarabun New"/>
+              <w:sz w:val="32"/>
+              <w:szCs w:val="32"/>
+            </w:rPr>
+          </w:pPr>
+          <w:r>
+            <w:rPr>
+              <w:rFonts w:ascii="TH Sarabun New" w:hAnsi="TH Sarabun New" w:cs="TH Sarabun New" w:hint="cs"/>
+              <w:sz w:val="28"/>
+              <w:szCs w:val="28"/>
+            </w:rPr>
+            <w:fldChar w:fldCharType="begin"/>
+          </w:r>
+          <w:r>
+            <w:rPr>
+              <w:rFonts w:ascii="TH Sarabun New" w:hAnsi="TH Sarabun New" w:cs="TH Sarabun New" w:hint="cs"/>
+              <w:sz w:val="28"/>
+              <w:szCs w:val="28"/>
+            </w:rPr>
+            <w:instrText xml:space="preserve"> PAGE   \* MERGEFORMAT </w:instrText>
+          </w:r>
+          <w:r>
+            <w:rPr>
+              <w:rFonts w:ascii="TH Sarabun New" w:hAnsi="TH Sarabun New" w:cs="TH Sarabun New" w:hint="cs"/>
+              <w:sz w:val="28"/>
+              <w:szCs w:val="28"/>
+            </w:rPr>
+            <w:fldChar w:fldCharType="separate"/>
+          </w:r>
+          <w:r>
+            <w:rPr>
+              <w:rFonts w:ascii="TH Sarabun New" w:hAnsi="TH Sarabun New" w:cs="TH Sarabun New" w:hint="cs"/>
+              <w:sz w:val="28"/>
+              <w:szCs w:val="28"/>
+            </w:rPr>
+            <w:t>1</w:t>
+          </w:r>
+          <w:r>
+            <w:rPr>
+              <w:rFonts w:ascii="TH Sarabun New" w:hAnsi="TH Sarabun New" w:cs="TH Sarabun New" w:hint="cs"/>
+              <w:sz w:val="28"/>
+              <w:szCs w:val="28"/>
+            </w:rPr>
+            <w:fldChar w:fldCharType="end"/>
+          </w:r>
+        </w:p>
+      </w:tc>
+    </w:tr>
+  </w:tbl>
+  <w:p>
+    <w:pPr>
+      <w:pStyle w:val="Footer"/>
+      <w:rPr>
+        <w:rFonts w:ascii="TH Sarabun New" w:hAnsi="TH Sarabun New" w:cs="TH Sarabun New"/>
+        <w:sz w:val="30"/>
+        <w:szCs w:val="30"/>
+      </w:rPr>
+    </w:pPr>
   </w:p>
 </w:ftr>
+</file>
+
+<file path=word/header1.xml><?xml version="1.0" encoding="utf-8"?>
+<w:hdr xmlns:m="http://schemas.openxmlformats.org/officeDocument/2006/math" xmlns:mc="http://schemas.openxmlformats.org/markup-compatibility/2006" xmlns:mo="http://schemas.microsoft.com/office/mac/office/2008/main" xmlns:mv="urn:schemas-microsoft-com:mac:vml" xmlns:o="urn:schemas-microsoft-com:office:office" xmlns:r="http://schemas.openxmlformats.org/officeDocument/2006/relationships" xmlns:v="urn:schemas-microsoft-com:vml" xmlns:w10="urn:schemas-microsoft-com:office:word" xmlns:w14="http://schemas.microsoft.com/office/word/2010/wordml" xmlns:w="http://schemas.openxmlformats.org/wordprocessingml/2006/main" xmlns:wne="http://schemas.microsoft.com/office/word/2006/wordml" xmlns:wp14="http://schemas.microsoft.com/office/word/2010/wordprocessingDrawing" xmlns:wp="http://schemas.openxmlformats.org/drawingml/2006/wordprocessingDrawing" xmlns:wpc="http://schemas.microsoft.com/office/word/2010/wordprocessingCanvas" xmlns:wpg="http://schemas.microsoft.com/office/word/2010/wordprocessingGroup" xmlns:wpi="http://schemas.microsoft.com/office/word/2010/wordprocessingInk" xmlns:wps="http://schemas.microsoft.com/office/word/2010/wordprocessingShape" mc:Ignorable="w14 wp14">
+  <w:tbl>
+    <w:tblPr>
+      <w:tblW w:w="5000" w:type="pct"/>
+      <w:tblBorders>
+        <w:bottom w:val="single" w:sz="4" w:space="0" w:color="auto"/>
+      </w:tblBorders>
+      <w:tblLook w:val="04A0" w:firstRow="1" w:lastRow="0" w:firstColumn="1" w:lastColumn="0" w:noHBand="0" w:noVBand="1"/>
+    </w:tblPr>
+    <w:tblGrid>
+      <w:gridCol w:w="1384"/>
+      <w:gridCol w:w="8362"/>
+    </w:tblGrid>
+    <w:tr>
+      <w:trPr>
+        <w:trHeight w:val="598"/>
+      </w:trPr>
+      <w:tc>
+        <w:tcPr>
+          <w:tcW w:w="710" w:type="pct"/>
+          <w:vAlign w:val="center"/>
+        </w:tcPr>
+        <w:p>
+          <w:pPr>
+            <w:pStyle w:val="Header"/>
+            <w:spacing w:line="192" w:lineRule="auto"/>
+            <w:rPr>
+              <w:rFonts w:ascii="TH Sarabun New" w:hAnsi="TH Sarabun New" w:cs="TH Sarabun New"/>
+            </w:rPr>
+          </w:pPr>
+          <w:r>
+            <w:rPr>
+              <w:rFonts w:ascii="TH Sarabun New" w:hAnsi="TH Sarabun New" w:cs="TH Sarabun New" w:hint="cs"/>
+              <w:noProof/>
+            </w:rPr>
+            <w:drawing>
+              <wp:inline distT="0" distB="0" distL="0" distR="0" wp14:anchorId="61D40FAE" wp14:editId="1F6A62D3">
+                <wp:extent cx="679450" cy="339725"/>
+                <wp:effectExtent l="0" t="0" r="0" b="0"/>
+                <wp:docPr id="934376281" name="Picture 2" descr="A logo of a science company&#10;&#10;Description automatically generated"/>
+                <wp:cNvGraphicFramePr>
+                  <a:graphicFrameLocks xmlns:a="http://schemas.openxmlformats.org/drawingml/2006/main"/>
+                </wp:cNvGraphicFramePr>
+                <a:graphic xmlns:a="http://schemas.openxmlformats.org/drawingml/2006/main">
+                  <a:graphicData uri="http://schemas.openxmlformats.org/drawingml/2006/picture">
+                    <pic:pic xmlns:pic="http://schemas.openxmlformats.org/drawingml/2006/picture">
+                      <pic:nvPicPr>
+                        <pic:cNvPr id="0" name="Picture 1" descr="A logo of a science company&#10;&#10;Description automatically generated"/>
+                        <pic:cNvPicPr>
+                          <a:picLocks/>
+                        </pic:cNvPicPr>
+                      </pic:nvPicPr>
+                      <pic:blipFill>
+                        <a:blip r:embed="rId1">
+                          <a:extLst>
+                            <a:ext uri="{28A0092B-C50C-407E-A947-70E740481C1C}">
+                              <a14:useLocalDpi xmlns:a14="http://schemas.microsoft.com/office/drawing/2010/main" val="0"/>
+                            </a:ext>
+                          </a:extLst>
+                        </a:blip>
+                        <a:srcRect/>
+                        <a:stretch>
+                          <a:fillRect/>
+                        </a:stretch>
+                      </pic:blipFill>
+                      <pic:spPr bwMode="auto">
+                        <a:xfrm>
+                          <a:off x="0" y="0"/>
+                          <a:ext cx="679450" cy="339725"/>
+                        </a:xfrm>
+                        <a:prstGeom prst="rect">
+                          <a:avLst/>
+                        </a:prstGeom>
+                        <a:noFill/>
+                        <a:ln>
+                          <a:noFill/>
+                        </a:ln>
+                      </pic:spPr>
+                    </pic:pic>
+                  </a:graphicData>
+                </a:graphic>
+              </wp:inline>
+            </w:drawing>
+          </w:r>
+        </w:p>
+      </w:tc>
+      <w:tc>
+        <w:tcPr>
+          <w:tcW w:w="4290" w:type="pct"/>
+          <w:vAlign w:val="center"/>
+        </w:tcPr>
+        <w:p>
+          <w:pPr>
+            <w:pStyle w:val="Header"/>
+            <w:spacing w:line="192" w:lineRule="auto"/>
+            <w:rPr>
+              <w:rFonts w:ascii="TH Sarabun New" w:hAnsi="TH Sarabun New" w:cs="TH Sarabun New"/>
+              <w:sz w:val="28"/>
+              <w:szCs w:val="28"/>
+            </w:rPr>
+          </w:pPr>
+          <w:r>
+            <w:rPr>
+              <w:rFonts w:ascii="TH Sarabun New" w:hAnsi="TH Sarabun New" w:cs="TH Sarabun New" w:hint="cs"/>
+              <w:sz w:val="28"/>
+              <w:szCs w:val="28"/>
+              <w:cs/>
+            </w:rPr>
+            <w:t>โครงการการประกวดโครงงานของนักวิทยาศาสตร์รุ่นเยาว์</w:t>
+          </w:r>
+        </w:p>
+        <w:p>
+          <w:pPr>
+            <w:pStyle w:val="Header"/>
+            <w:spacing w:line="192" w:lineRule="auto"/>
+            <w:rPr>
+              <w:rFonts w:ascii="TH Sarabun New" w:hAnsi="TH Sarabun New" w:cs="TH Sarabun New"/>
+              <w:b/>
+              <w:bCs/>
+              <w:sz w:val="28"/>
+              <w:szCs w:val="28"/>
+            </w:rPr>
+          </w:pPr>
+          <w:r>
+            <w:rPr>
+              <w:rFonts w:ascii="TH Sarabun New" w:hAnsi="TH Sarabun New" w:cs="TH Sarabun New" w:hint="cs"/>
+              <w:sz w:val="28"/>
+              <w:szCs w:val="28"/>
+            </w:rPr>
+            <w:t>(Young Scientist Competition: YSC)</w:t>
+          </w:r>
+        </w:p>
+      </w:tc>
+    </w:tr>
+  </w:tbl>
+  <w:p>
+    <w:pPr>
+      <w:pStyle w:val="Header"/>
+      <w:rPr>
+        <w:rFonts w:ascii="TH Sarabun New" w:hAnsi="TH Sarabun New" w:cs="TH Sarabun New"/>
+        <w:sz w:val="28"/>
+        <w:szCs w:val="28"/>
+      </w:rPr>
+    </w:pPr>
+  </w:p>
+</w:hdr>
 </file>
 
 <file path=word/numbering.xml><?xml version="1.0" encoding="utf-8"?>

</xml_diff>